<commit_message>
Make DMS corretor table dynamic (unlimited rows)
Replace 4 fixed numbered rows in DMS contrato_cabeca.docx with a single
model row using standard CORRETOR_EMPRESA/CRECI/CPFCNPJ/VALOR placeholders.
substituirCorretores now handles DMS the same as BCO/BAK/H23/AAZ/SMK.
Remove DMS-specific numbered substitution code.

https://claude.ai/code/session_01L1sfwnXz59t3NvQDJuRWQR
</commit_message>
<xml_diff>
--- a/template/supabase-files/DMS contrato_cabeca.docx
+++ b/template/supabase-files/DMS contrato_cabeca.docx
@@ -2660,7 +2660,7 @@
                       <w:szCs w:val="24"/>
                       <w:lang w:val="pt-BR"/>
                     </w:rPr>
-                    <w:t>«EMPRESA_CORRETOR1»</w:t>
+                    <w:t>«CORRETOR_EMPRESA»</w:t>
                   </w:r>
                 </w:p>
               </w:tc>
@@ -2687,7 +2687,7 @@
                       <w:noProof/>
                       <w:szCs w:val="24"/>
                     </w:rPr>
-                    <w:t>«INSCRICAO_CRECI1»</w:t>
+                    <w:t>«CORRETOR_CRECI»</w:t>
                   </w:r>
                 </w:p>
               </w:tc>
@@ -2714,7 +2714,7 @@
                       <w:noProof/>
                       <w:szCs w:val="24"/>
                     </w:rPr>
-                    <w:t>«CPF_CNPJ1»</w:t>
+                    <w:t>«CORRETOR_CPFCNPJ»</w:t>
                   </w:r>
                 </w:p>
               </w:tc>
@@ -2741,337 +2741,7 @@
                       <w:noProof/>
                       <w:szCs w:val="24"/>
                     </w:rPr>
-                    <w:t>«VALORCOMISSAO1»</w:t>
-                  </w:r>
-                </w:p>
-              </w:tc>
-            </w:tr>
-            <w:tr>
-              <w:tc>
-                <w:tcPr>
-                  <w:tcW w:w="2701" w:type="dxa"/>
-                  <w:vAlign w:val="center"/>
-                </w:tcPr>
-                <w:p>
-                  <w:pPr>
-                    <w:pStyle w:val="Corpodetexto2"/>
-                    <w:jc w:val="center"/>
-                    <w:rPr>
-                      <w:rFonts w:cs="Calibri"/>
-                      <w:i/>
-                      <w:iCs/>
-                      <w:szCs w:val="24"/>
-                    </w:rPr>
-                  </w:pPr>
-                  <w:r>
-                    <w:rPr>
-                      <w:rFonts w:cs="Calibri"/>
-                      <w:iCs/>
-                      <w:noProof/>
-                      <w:szCs w:val="24"/>
-                    </w:rPr>
-                    <w:t>«EMPRESA_CORRETOR2»</w:t>
-                  </w:r>
-                </w:p>
-              </w:tc>
-              <w:tc>
-                <w:tcPr>
-                  <w:tcW w:w="2244" w:type="dxa"/>
-                  <w:vAlign w:val="center"/>
-                </w:tcPr>
-                <w:p>
-                  <w:pPr>
-                    <w:pStyle w:val="Corpodetexto2"/>
-                    <w:jc w:val="center"/>
-                    <w:rPr>
-                      <w:rFonts w:cs="Calibri"/>
-                      <w:i/>
-                      <w:iCs/>
-                      <w:szCs w:val="24"/>
-                    </w:rPr>
-                  </w:pPr>
-                  <w:r>
-                    <w:rPr>
-                      <w:rFonts w:cs="Calibri"/>
-                      <w:iCs/>
-                      <w:noProof/>
-                      <w:szCs w:val="24"/>
-                    </w:rPr>
-                    <w:t>«INSCRICAO_CRECI2»</w:t>
-                  </w:r>
-                </w:p>
-              </w:tc>
-              <w:tc>
-                <w:tcPr>
-                  <w:tcW w:w="1964" w:type="dxa"/>
-                  <w:vAlign w:val="center"/>
-                </w:tcPr>
-                <w:p>
-                  <w:pPr>
-                    <w:pStyle w:val="Corpodetexto2"/>
-                    <w:jc w:val="center"/>
-                    <w:rPr>
-                      <w:rFonts w:cs="Calibri"/>
-                      <w:i/>
-                      <w:iCs/>
-                      <w:szCs w:val="24"/>
-                    </w:rPr>
-                  </w:pPr>
-                  <w:r>
-                    <w:rPr>
-                      <w:rFonts w:cs="Calibri"/>
-                      <w:iCs/>
-                      <w:noProof/>
-                      <w:szCs w:val="24"/>
-                    </w:rPr>
-                    <w:t>«CPF_CNPJ2»</w:t>
-                  </w:r>
-                </w:p>
-              </w:tc>
-              <w:tc>
-                <w:tcPr>
-                  <w:tcW w:w="2222" w:type="dxa"/>
-                  <w:vAlign w:val="center"/>
-                </w:tcPr>
-                <w:p>
-                  <w:pPr>
-                    <w:pStyle w:val="Corpodetexto2"/>
-                    <w:jc w:val="center"/>
-                    <w:rPr>
-                      <w:rFonts w:cs="Calibri"/>
-                      <w:i/>
-                      <w:iCs/>
-                      <w:szCs w:val="24"/>
-                    </w:rPr>
-                  </w:pPr>
-                  <w:r>
-                    <w:rPr>
-                      <w:rFonts w:cs="Calibri"/>
-                      <w:iCs/>
-                      <w:noProof/>
-                      <w:szCs w:val="24"/>
-                    </w:rPr>
-                    <w:t>«VALORCOMISSAO2»</w:t>
-                  </w:r>
-                </w:p>
-              </w:tc>
-            </w:tr>
-            <w:tr>
-              <w:tc>
-                <w:tcPr>
-                  <w:tcW w:w="2701" w:type="dxa"/>
-                  <w:vAlign w:val="center"/>
-                </w:tcPr>
-                <w:p>
-                  <w:pPr>
-                    <w:pStyle w:val="Corpodetexto2"/>
-                    <w:jc w:val="center"/>
-                    <w:rPr>
-                      <w:rFonts w:cs="Calibri"/>
-                      <w:i/>
-                      <w:iCs/>
-                      <w:szCs w:val="24"/>
-                    </w:rPr>
-                  </w:pPr>
-                  <w:r>
-                    <w:rPr>
-                      <w:rFonts w:cs="Calibri"/>
-                      <w:iCs/>
-                      <w:noProof/>
-                      <w:szCs w:val="24"/>
-                    </w:rPr>
-                    <w:t>«EMPRESA_CORRETOR3»</w:t>
-                  </w:r>
-                </w:p>
-              </w:tc>
-              <w:tc>
-                <w:tcPr>
-                  <w:tcW w:w="2244" w:type="dxa"/>
-                  <w:vAlign w:val="center"/>
-                </w:tcPr>
-                <w:p>
-                  <w:pPr>
-                    <w:pStyle w:val="Corpodetexto2"/>
-                    <w:jc w:val="center"/>
-                    <w:rPr>
-                      <w:rFonts w:cs="Calibri"/>
-                      <w:i/>
-                      <w:iCs/>
-                      <w:szCs w:val="24"/>
-                    </w:rPr>
-                  </w:pPr>
-                  <w:r>
-                    <w:rPr>
-                      <w:rFonts w:cs="Calibri"/>
-                      <w:iCs/>
-                      <w:noProof/>
-                      <w:szCs w:val="24"/>
-                    </w:rPr>
-                    <w:t>«INSCRICAO_CRECI3»</w:t>
-                  </w:r>
-                </w:p>
-              </w:tc>
-              <w:tc>
-                <w:tcPr>
-                  <w:tcW w:w="1964" w:type="dxa"/>
-                  <w:vAlign w:val="center"/>
-                </w:tcPr>
-                <w:p>
-                  <w:pPr>
-                    <w:pStyle w:val="Corpodetexto2"/>
-                    <w:jc w:val="center"/>
-                    <w:rPr>
-                      <w:rFonts w:cs="Calibri"/>
-                      <w:i/>
-                      <w:iCs/>
-                      <w:szCs w:val="24"/>
-                    </w:rPr>
-                  </w:pPr>
-                  <w:r>
-                    <w:rPr>
-                      <w:rFonts w:cs="Calibri"/>
-                      <w:iCs/>
-                      <w:noProof/>
-                      <w:szCs w:val="24"/>
-                    </w:rPr>
-                    <w:t>«CPF_CNPJ3»</w:t>
-                  </w:r>
-                </w:p>
-              </w:tc>
-              <w:tc>
-                <w:tcPr>
-                  <w:tcW w:w="2222" w:type="dxa"/>
-                  <w:vAlign w:val="center"/>
-                </w:tcPr>
-                <w:p>
-                  <w:pPr>
-                    <w:pStyle w:val="Corpodetexto2"/>
-                    <w:jc w:val="center"/>
-                    <w:rPr>
-                      <w:rFonts w:cs="Calibri"/>
-                      <w:i/>
-                      <w:iCs/>
-                      <w:szCs w:val="24"/>
-                    </w:rPr>
-                  </w:pPr>
-                  <w:r>
-                    <w:rPr>
-                      <w:rFonts w:cs="Calibri"/>
-                      <w:iCs/>
-                      <w:noProof/>
-                      <w:szCs w:val="24"/>
-                    </w:rPr>
-                    <w:t>«VALORCOMISSAO3»</w:t>
-                  </w:r>
-                </w:p>
-              </w:tc>
-            </w:tr>
-            <w:tr>
-              <w:tc>
-                <w:tcPr>
-                  <w:tcW w:w="2701" w:type="dxa"/>
-                  <w:vAlign w:val="center"/>
-                </w:tcPr>
-                <w:p>
-                  <w:pPr>
-                    <w:pStyle w:val="Corpodetexto2"/>
-                    <w:jc w:val="center"/>
-                    <w:rPr>
-                      <w:rFonts w:cs="Calibri"/>
-                      <w:i/>
-                      <w:iCs/>
-                      <w:szCs w:val="24"/>
-                    </w:rPr>
-                  </w:pPr>
-                  <w:r>
-                    <w:rPr>
-                      <w:rFonts w:cs="Calibri"/>
-                      <w:iCs/>
-                      <w:noProof/>
-                      <w:szCs w:val="24"/>
-                    </w:rPr>
-                    <w:t>«EMPRESA_CORRETOR4»</w:t>
-                  </w:r>
-                </w:p>
-              </w:tc>
-              <w:tc>
-                <w:tcPr>
-                  <w:tcW w:w="2244" w:type="dxa"/>
-                  <w:vAlign w:val="center"/>
-                </w:tcPr>
-                <w:p>
-                  <w:pPr>
-                    <w:pStyle w:val="Corpodetexto2"/>
-                    <w:jc w:val="center"/>
-                    <w:rPr>
-                      <w:rFonts w:cs="Calibri"/>
-                      <w:i/>
-                      <w:iCs/>
-                      <w:szCs w:val="24"/>
-                    </w:rPr>
-                  </w:pPr>
-                  <w:r>
-                    <w:rPr>
-                      <w:rFonts w:cs="Calibri"/>
-                      <w:iCs/>
-                      <w:noProof/>
-                      <w:szCs w:val="24"/>
-                    </w:rPr>
-                    <w:t>«INSCRICAO_CRECI4»</w:t>
-                  </w:r>
-                </w:p>
-              </w:tc>
-              <w:tc>
-                <w:tcPr>
-                  <w:tcW w:w="1964" w:type="dxa"/>
-                  <w:vAlign w:val="center"/>
-                </w:tcPr>
-                <w:p>
-                  <w:pPr>
-                    <w:pStyle w:val="Corpodetexto2"/>
-                    <w:jc w:val="center"/>
-                    <w:rPr>
-                      <w:rFonts w:cs="Calibri"/>
-                      <w:i/>
-                      <w:iCs/>
-                      <w:szCs w:val="24"/>
-                    </w:rPr>
-                  </w:pPr>
-                  <w:r>
-                    <w:rPr>
-                      <w:rFonts w:cs="Calibri"/>
-                      <w:iCs/>
-                      <w:noProof/>
-                      <w:szCs w:val="24"/>
-                    </w:rPr>
-                    <w:t>«CPF_CNPJ4»</w:t>
-                  </w:r>
-                </w:p>
-              </w:tc>
-              <w:tc>
-                <w:tcPr>
-                  <w:tcW w:w="2222" w:type="dxa"/>
-                  <w:vAlign w:val="center"/>
-                </w:tcPr>
-                <w:p>
-                  <w:pPr>
-                    <w:pStyle w:val="Corpodetexto2"/>
-                    <w:jc w:val="center"/>
-                    <w:rPr>
-                      <w:rFonts w:cs="Calibri"/>
-                      <w:i/>
-                      <w:iCs/>
-                      <w:szCs w:val="24"/>
-                    </w:rPr>
-                  </w:pPr>
-                  <w:r>
-                    <w:rPr>
-                      <w:rFonts w:cs="Calibri"/>
-                      <w:iCs/>
-                      <w:noProof/>
-                      <w:szCs w:val="24"/>
-                    </w:rPr>
-                    <w:t>«VALORCOMISSAO4»</w:t>
+                    <w:t>«CORRETOR_VALOR»</w:t>
                   </w:r>
                 </w:p>
               </w:tc>

</xml_diff>